<commit_message>
clean project and verify multi asset UI
</commit_message>
<xml_diff>
--- a/ReinforcementTrading_Part_1/reports/TTCS_MOCK2_BoSung.docx
+++ b/ReinforcementTrading_Part_1/reports/TTCS_MOCK2_BoSung.docx
@@ -8,6 +8,7 @@
       </w:pPr>
       <w:r>
         <w:rPr>
+          <w:rFonts w:ascii="Arial" w:hAnsi="Arial"/>
           <w:b/>
           <w:sz w:val="30"/>
         </w:rPr>
@@ -20,13 +21,19 @@
       </w:pPr>
       <w:r>
         <w:rPr>
+          <w:rFonts w:ascii="Arial" w:hAnsi="Arial"/>
           <w:i/>
+          <w:sz w:val="21"/>
         </w:rPr>
         <w:t>Tài liệu bổ sung cho báo cáo TTCS_MOCK2, không thay thế PDF gốc</w:t>
       </w:r>
     </w:p>
     <w:p>
       <w:r>
+        <w:rPr>
+          <w:rFonts w:ascii="Arial" w:hAnsi="Arial"/>
+          <w:sz w:val="21"/>
+        </w:rPr>
         <w:t>Phụ lục này tập trung vào các phần giảng viên yêu cầu làm rõ thêm: nghiên cứu liên quan về trading bot, điểm giống/khác so với các hướng phổ biến, các kỹ thuật giảm overfitting theo thực hành nghiên cứu, và các nâng cấp đã triển khai trong hệ thống mới. Nội dung lý thuyết PPO, DQN, A2C, TRPO đã có trong PDF gốc nên không lặp lại.</w:t>
       </w:r>
     </w:p>
@@ -35,11 +42,19 @@
         <w:pStyle w:val="Heading1"/>
       </w:pPr>
       <w:r>
+        <w:rPr>
+          <w:rFonts w:ascii="Arial" w:hAnsi="Arial"/>
+          <w:sz w:val="21"/>
+        </w:rPr>
         <w:t>1. Survey ngắn về Trading Bot và RL Trading</w:t>
       </w:r>
     </w:p>
     <w:p>
       <w:r>
+        <w:rPr>
+          <w:rFonts w:ascii="Arial" w:hAnsi="Arial"/>
+          <w:sz w:val="21"/>
+        </w:rPr>
         <w:t>Trading bot là hướng phổ biến, vì vậy đóng góp của nhóm cần được đặt cạnh các nhóm phương pháp thường gặp thay vì chỉ mô tả PPO riêng lẻ.</w:t>
       </w:r>
     </w:p>
@@ -326,6 +341,10 @@
         <w:pStyle w:val="Heading1"/>
       </w:pPr>
       <w:r>
+        <w:rPr>
+          <w:rFonts w:ascii="Arial" w:hAnsi="Arial"/>
+          <w:sz w:val="21"/>
+        </w:rPr>
         <w:t>2. Điểm giống và khác của phương pháp nhóm</w:t>
       </w:r>
     </w:p>
@@ -612,6 +631,10 @@
         <w:pStyle w:val="Heading1"/>
       </w:pPr>
       <w:r>
+        <w:rPr>
+          <w:rFonts w:ascii="Arial" w:hAnsi="Arial"/>
+          <w:sz w:val="21"/>
+        </w:rPr>
         <w:t>3. Kiến trúc nâng cấp</w:t>
       </w:r>
     </w:p>
@@ -620,6 +643,10 @@
         <w:pStyle w:val="ListBullet"/>
       </w:pPr>
       <w:r>
+        <w:rPr>
+          <w:rFonts w:ascii="Arial" w:hAnsi="Arial"/>
+          <w:sz w:val="21"/>
+        </w:rPr>
         <w:t>Code mới được gom vào ReinforcementTrading_Part_1/trading_bot, gồm data, features, environment, training, evaluation, live signal và UI; không tạo thêm một dự án riêng ở root.</w:t>
       </w:r>
     </w:p>
@@ -628,6 +655,10 @@
         <w:pStyle w:val="ListBullet"/>
       </w:pPr>
       <w:r>
+        <w:rPr>
+          <w:rFonts w:ascii="Arial" w:hAnsi="Arial"/>
+          <w:sz w:val="21"/>
+        </w:rPr>
         <w:t>Model được lưu theo cấu trúc ReinforcementTrading_Part_1/artifacts/models/&lt;symbol&gt;/&lt;timeframe&gt;/&lt;run_id&gt;, phù hợp khi có nhiều tài sản và nhiều lần train.</w:t>
       </w:r>
     </w:p>
@@ -636,6 +667,10 @@
         <w:pStyle w:val="ListBullet"/>
       </w:pPr>
       <w:r>
+        <w:rPr>
+          <w:rFonts w:ascii="Arial" w:hAnsi="Arial"/>
+          <w:sz w:val="21"/>
+        </w:rPr>
         <w:t>BTC, NEAR, ETH, SOL, PAXG và các cặp USDT khác dùng chung pipeline; điểm khác nhau nằm ở symbol, timeframe, số bước train và artifact.</w:t>
       </w:r>
     </w:p>
@@ -644,6 +679,10 @@
         <w:pStyle w:val="ListBullet"/>
       </w:pPr>
       <w:r>
+        <w:rPr>
+          <w:rFonts w:ascii="Arial" w:hAnsi="Arial"/>
+          <w:sz w:val="21"/>
+        </w:rPr>
         <w:t>Các script cũ được giữ lại làm legacy/reference, đặc biệt là model BTC/Gold 10M đã train trước đó.</w:t>
       </w:r>
     </w:p>
@@ -652,11 +691,19 @@
         <w:pStyle w:val="Heading1"/>
       </w:pPr>
       <w:r>
+        <w:rPr>
+          <w:rFonts w:ascii="Arial" w:hAnsi="Arial"/>
+          <w:sz w:val="21"/>
+        </w:rPr>
         <w:t>4. Bổ sung kỹ thuật chống Overfitting</w:t>
       </w:r>
     </w:p>
     <w:p>
       <w:r>
+        <w:rPr>
+          <w:rFonts w:ascii="Arial" w:hAnsi="Arial"/>
+          <w:sz w:val="21"/>
+        </w:rPr>
         <w:t>Trong bản cũ, nhóm đã có time-based split, train-only normalization và EvalCallback. Bản nâng cấp bổ sung thêm các kỹ thuật thường gặp trong nghiên cứu RL trading để đo và giảm nguy cơ overfitting thay vì chỉ thay tham số giao dịch.</w:t>
       </w:r>
     </w:p>
@@ -1192,6 +1239,10 @@
         <w:pStyle w:val="Heading1"/>
       </w:pPr>
       <w:r>
+        <w:rPr>
+          <w:rFonts w:ascii="Arial" w:hAnsi="Arial"/>
+          <w:sz w:val="21"/>
+        </w:rPr>
         <w:t>5. Các hướng phát triển mục 11 đã áp dụng</w:t>
       </w:r>
     </w:p>
@@ -2151,6 +2202,10 @@
         <w:pStyle w:val="Heading1"/>
       </w:pPr>
       <w:r>
+        <w:rPr>
+          <w:rFonts w:ascii="Arial" w:hAnsi="Arial"/>
+          <w:sz w:val="21"/>
+        </w:rPr>
         <w:t>6. Kết quả và artifact cần báo cáo</w:t>
       </w:r>
     </w:p>
@@ -2159,6 +2214,10 @@
         <w:pStyle w:val="ListBullet"/>
       </w:pPr>
       <w:r>
+        <w:rPr>
+          <w:rFonts w:ascii="Arial" w:hAnsi="Arial"/>
+          <w:sz w:val="21"/>
+        </w:rPr>
         <w:t>Model chính đã train: BTCUSDT 1h, 2,000,000 timesteps, dữ liệu lấy trực tiếp từ Binance API và lưu tại ReinforcementTrading_Part_1/artifacts/models/BTCUSDT/1h/btc_2m_risk_normalized_20260527.</w:t>
       </w:r>
     </w:p>
@@ -2167,6 +2226,10 @@
         <w:pStyle w:val="ListBullet"/>
       </w:pPr>
       <w:r>
+        <w:rPr>
+          <w:rFonts w:ascii="Arial" w:hAnsi="Arial"/>
+          <w:sz w:val="21"/>
+        </w:rPr>
         <w:t>Mỗi lần train lưu model.zip, train_config.json, train_stats.npz và các JSON metrics.</w:t>
       </w:r>
     </w:p>
@@ -2175,6 +2238,10 @@
         <w:pStyle w:val="ListBullet"/>
       </w:pPr>
       <w:r>
+        <w:rPr>
+          <w:rFonts w:ascii="Arial" w:hAnsi="Arial"/>
+          <w:sz w:val="21"/>
+        </w:rPr>
         <w:t>Các hình bắt buộc: equity_curve.png, drawdown_curve.png, baseline_comparison.png, stress_test_comparison.png.</w:t>
       </w:r>
     </w:p>
@@ -2195,17 +2262,27 @@
         <w:pStyle w:val="Heading2"/>
       </w:pPr>
       <w:r>
+        <w:rPr>
+          <w:rFonts w:ascii="Arial" w:hAnsi="Arial"/>
+          <w:sz w:val="21"/>
+        </w:rPr>
         <w:t>6.1. Kết quả BTC 2M sau nâng cấp risk-normalized</w:t>
       </w:r>
     </w:p>
     <w:p>
       <w:r>
         <w:rPr>
+          <w:rFonts w:ascii="Arial" w:hAnsi="Arial"/>
           <w:b/>
+          <w:sz w:val="21"/>
         </w:rPr>
         <w:t xml:space="preserve">Ý nghĩa chính: </w:t>
       </w:r>
       <w:r>
+        <w:rPr>
+          <w:rFonts w:ascii="Arial" w:hAnsi="Arial"/>
+          <w:sz w:val="21"/>
+        </w:rPr>
         <w:t>run 2M đã kiểm tra được toàn bộ pipeline API-first, checkpoint validation, baseline, stress test và chart artifact. Kết quả hiện tại trung thực hơn bản cũ: PPO không bị lỗi âm vốn/vị thế quá lớn, nhưng vẫn chưa vượt các baseline đơn giản trên OOS test.</w:t>
       </w:r>
     </w:p>
@@ -2756,17 +2833,135 @@
     <w:p>
       <w:r>
         <w:rPr>
+          <w:rFonts w:ascii="Arial" w:hAnsi="Arial"/>
           <w:b/>
+          <w:sz w:val="21"/>
         </w:rPr>
         <w:t xml:space="preserve">Kết luận báo cáo: </w:t>
       </w:r>
       <w:r>
+        <w:rPr>
+          <w:rFonts w:ascii="Arial" w:hAnsi="Arial"/>
+          <w:sz w:val="21"/>
+        </w:rPr>
         <w:t>điểm mạnh của bản bổ sung không phải là tuyên bố lợi nhuận cao, mà là hệ thống đã có cơ chế phát hiện overfitting: model phải được so với baseline, kiểm tra stress cost, và ghi lại cảnh báo PBO-style. Đây là cơ sở hợp lý để đề xuất các bước tiếp theo như Optuna, RecurrentPPO/CNN candidate, multi-seed và tinh chỉnh reward.</w:t>
       </w:r>
     </w:p>
     <w:p>
       <w:r>
+        <w:rPr>
+          <w:rFonts w:ascii="Arial" w:hAnsi="Arial"/>
+          <w:sz w:val="21"/>
+        </w:rPr>
         <w:t>Artifact chính: ReinforcementTrading_Part_1/artifacts/models/BTCUSDT/1h/btc_2m_risk_normalized_20260527 gồm model.zip, metrics.json, baseline_metrics.json, walk_forward_metrics.json, stress_test_metrics.json, overfit_report.json và các hình equity/drawdown/baseline/stress.</w:t>
+      </w:r>
+    </w:p>
+    <w:p>
+      <w:pPr>
+        <w:pStyle w:val="Heading2"/>
+      </w:pPr>
+      <w:r>
+        <w:rPr>
+          <w:rFonts w:ascii="Arial" w:hAnsi="Arial"/>
+          <w:sz w:val="21"/>
+        </w:rPr>
+        <w:t>6.2. Cập nhật bổ sung sau kiểm thử UI và dọn cấu trúc</w:t>
+      </w:r>
+    </w:p>
+    <w:p>
+      <w:pPr>
+        <w:pStyle w:val="ListBullet"/>
+      </w:pPr>
+      <w:r>
+        <w:rPr>
+          <w:rFonts w:ascii="Arial" w:hAnsi="Arial"/>
+          <w:sz w:val="21"/>
+        </w:rPr>
+        <w:t>Cấu trúc dự án đã được gom lại vào ReinforcementTrading_Part_1; các script BTC/Gold cũ, CSV cũ, chart cũ và training_runs cũ được dọn để tránh nhầm lẫn. Model 10M cũ được giữ trong artifacts/legacy_models để backup.</w:t>
+      </w:r>
+    </w:p>
+    <w:p>
+      <w:pPr>
+        <w:pStyle w:val="ListBullet"/>
+      </w:pPr>
+      <w:r>
+        <w:rPr>
+          <w:rFonts w:ascii="Arial" w:hAnsi="Arial"/>
+          <w:sz w:val="21"/>
+        </w:rPr>
+        <w:t>Dashboard dùng form submit thay vì widget rời, giúp việc đổi tham số như BTCUSDT, timeframe 4h, 1,000,000 timesteps, cnn1d và Optuna trial 1 được truyền rõ ràng vào trainer.</w:t>
+      </w:r>
+    </w:p>
+    <w:p>
+      <w:pPr>
+        <w:pStyle w:val="ListBullet"/>
+      </w:pPr>
+      <w:r>
+        <w:rPr>
+          <w:rFonts w:ascii="Arial" w:hAnsi="Arial"/>
+          <w:sz w:val="21"/>
+        </w:rPr>
+        <w:t>Pipeline mới bỏ phụ thuộc pandas_ta_classic trong nhánh UI/trading_bot; chỉ báo kỹ thuật được tính bằng pandas/numpy để giảm lỗi môi trường khi chạy demo.</w:t>
+      </w:r>
+    </w:p>
+    <w:p>
+      <w:pPr>
+        <w:pStyle w:val="ListBullet"/>
+      </w:pPr>
+      <w:r>
+        <w:rPr>
+          <w:rFonts w:ascii="Arial" w:hAnsi="Arial"/>
+          <w:sz w:val="21"/>
+        </w:rPr>
+        <w:t>Trainer xuất thêm selected_strategy.json. Nếu PPO không thắng baseline OOS, hệ thống ghi cảnh báo overfit và chỉ ra baseline/candidate tốt nhất thay vì kết luận cảm tính.</w:t>
+      </w:r>
+    </w:p>
+    <w:p>
+      <w:pPr>
+        <w:pStyle w:val="ListBullet"/>
+      </w:pPr>
+      <w:r>
+        <w:rPr>
+          <w:rFonts w:ascii="Arial" w:hAnsi="Arial"/>
+          <w:sz w:val="21"/>
+        </w:rPr>
+        <w:t>Kiểm thử BTCUSDT 4h, cnn1d, Optuna=1 đã chạy end-to-end với Binance API, HPO, PPO, baseline, stress test và artifact. Bản rút gọn 100,000 timesteps cho PPO return 0.00% vì model chọn không vào lệnh trên OOS; đây là tín hiệu an toàn hơn overtrade nhưng chưa đạt mục tiêu lợi nhuận dương.</w:t>
+      </w:r>
+    </w:p>
+    <w:p>
+      <w:pPr>
+        <w:pStyle w:val="ListBullet"/>
+      </w:pPr>
+      <w:r>
+        <w:rPr>
+          <w:rFonts w:ascii="Arial" w:hAnsi="Arial"/>
+          <w:sz w:val="21"/>
+        </w:rPr>
+        <w:t>Mục tiêu tiếp theo nếu muốn PPO dương: chạy 1,000,000 timesteps như cấu hình UI mặc định, thử multi-seed và tăng Optuna trials; chỉ nhận PPO là model chính khi nó thắng baseline trên OOS/test-only thay vì chỉ thắng trong train.</w:t>
+      </w:r>
+    </w:p>
+    <w:p>
+      <w:pPr>
+        <w:pStyle w:val="ListBullet"/>
+      </w:pPr>
+      <w:r>
+        <w:rPr>
+          <w:rFonts w:ascii="Arial" w:hAnsi="Arial"/>
+          <w:sz w:val="21"/>
+        </w:rPr>
+        <w:t>selected_strategy.json chọn rsi_rule thay vì PPO và ghi rõ cảnh báo: PPO did not beat the best OOS baseline. Đây là cơ chế chống overfitting theo hướng không chọn model chỉ vì đã train xong.</w:t>
+      </w:r>
+    </w:p>
+    <w:p>
+      <w:pPr>
+        <w:pStyle w:val="ListBullet"/>
+      </w:pPr>
+      <w:r>
+        <w:rPr>
+          <w:rFonts w:ascii="Arial" w:hAnsi="Arial"/>
+          <w:sz w:val="21"/>
+        </w:rPr>
+        <w:t>Kết quả cụ thể của kiểm thử 100k: PPO return 0.00%, max drawdown 0.00%, total trades 0; baseline RSI return +19.13%, random policy +9.31%, Buy &amp; Hold +5.52%, MA crossover -1.63%.</w:t>
       </w:r>
     </w:p>
     <w:p>
@@ -2774,6 +2969,10 @@
         <w:pStyle w:val="Heading1"/>
       </w:pPr>
       <w:r>
+        <w:rPr>
+          <w:rFonts w:ascii="Arial" w:hAnsi="Arial"/>
+          <w:sz w:val="21"/>
+        </w:rPr>
         <w:t>7. Tài liệu tham khảo bổ sung</w:t>
       </w:r>
     </w:p>
@@ -2782,6 +2981,10 @@
         <w:pStyle w:val="ListBullet"/>
       </w:pPr>
       <w:r>
+        <w:rPr>
+          <w:rFonts w:ascii="Arial" w:hAnsi="Arial"/>
+          <w:sz w:val="21"/>
+        </w:rPr>
         <w:t>Schulman et al. (2017), Proximal Policy Optimization Algorithms, https://arxiv.org/abs/1707.06347</w:t>
       </w:r>
     </w:p>
@@ -2790,6 +2993,10 @@
         <w:pStyle w:val="ListBullet"/>
       </w:pPr>
       <w:r>
+        <w:rPr>
+          <w:rFonts w:ascii="Arial" w:hAnsi="Arial"/>
+          <w:sz w:val="21"/>
+        </w:rPr>
         <w:t>Liu et al. (2020), FinRL: A Deep Reinforcement Learning Library for Automated Stock Trading, https://arxiv.org/abs/2011.09607</w:t>
       </w:r>
     </w:p>
@@ -2798,6 +3005,10 @@
         <w:pStyle w:val="ListBullet"/>
       </w:pPr>
       <w:r>
+        <w:rPr>
+          <w:rFonts w:ascii="Arial" w:hAnsi="Arial"/>
+          <w:sz w:val="21"/>
+        </w:rPr>
         <w:t>Yang et al. (2020), Deep Reinforcement Learning for Automated Stock Trading: An Ensemble Strategy, https://openfin.engineering.columbia.edu/sites/default/files/content/publications/ensemble.pdf</w:t>
       </w:r>
     </w:p>
@@ -2806,6 +3017,10 @@
         <w:pStyle w:val="ListBullet"/>
       </w:pPr>
       <w:r>
+        <w:rPr>
+          <w:rFonts w:ascii="Arial" w:hAnsi="Arial"/>
+          <w:sz w:val="21"/>
+        </w:rPr>
         <w:t>Deep Reinforcement Learning for Trading - A Critical Survey, https://www.mdpi.com/2306-5729/6/11/119</w:t>
       </w:r>
     </w:p>
@@ -2814,6 +3029,10 @@
         <w:pStyle w:val="ListBullet"/>
       </w:pPr>
       <w:r>
+        <w:rPr>
+          <w:rFonts w:ascii="Arial" w:hAnsi="Arial"/>
+          <w:sz w:val="21"/>
+        </w:rPr>
         <w:t>Lucarelli &amp; Borrotti (2022), Deep Reinforcement Learning for Cryptocurrency Trading: Practical Approach to Address Backtest Overfitting, https://arxiv.org/abs/2209.05559</w:t>
       </w:r>
     </w:p>
@@ -2822,6 +3041,10 @@
         <w:pStyle w:val="ListBullet"/>
       </w:pPr>
       <w:r>
+        <w:rPr>
+          <w:rFonts w:ascii="Arial" w:hAnsi="Arial"/>
+          <w:sz w:val="21"/>
+        </w:rPr>
         <w:t>Binance Spot API Documentation, https://developers.binance.com/docs/binance-spot-api-docs/rest-api/market-data-endpoints</w:t>
       </w:r>
     </w:p>

</xml_diff>